<commit_message>
Atualização dos documentos da Sprint
</commit_message>
<xml_diff>
--- a/Sprint Backlog - Brahyan Dias.docx
+++ b/Sprint Backlog - Brahyan Dias.docx
@@ -15,7 +15,7 @@
           <w:szCs w:val="46"/>
         </w:rPr>
       </w:pPr>
-      <w:bookmarkStart w:colFirst="0" w:colLast="0" w:name="_nnvt6dfwcqwh" w:id="0"/>
+      <w:bookmarkStart w:colFirst="0" w:colLast="0" w:name="_jim9dkqaguiv" w:id="0"/>
       <w:bookmarkEnd w:id="0"/>
       <w:r>
         <w:rPr>
@@ -41,7 +41,7 @@
           <w:szCs w:val="34"/>
         </w:rPr>
       </w:pPr>
-      <w:bookmarkStart w:colFirst="0" w:colLast="0" w:name="_v4g8yk7w6ndc" w:id="1"/>
+      <w:bookmarkStart w:colFirst="0" w:colLast="0" w:name="_anoj89vaa7qn" w:id="1"/>
       <w:bookmarkEnd w:id="1"/>
       <w:r>
         <w:rPr>
@@ -79,7 +79,7 @@
           <w:szCs w:val="34"/>
         </w:rPr>
       </w:pPr>
-      <w:bookmarkStart w:colFirst="0" w:colLast="0" w:name="_ts1aqun6hqcb" w:id="2"/>
+      <w:bookmarkStart w:colFirst="0" w:colLast="0" w:name="_gi48g5kase68" w:id="2"/>
       <w:bookmarkEnd w:id="2"/>
       <w:r>
         <w:rPr>
@@ -106,7 +106,7 @@
           <w:szCs w:val="26"/>
         </w:rPr>
       </w:pPr>
-      <w:bookmarkStart w:colFirst="0" w:colLast="0" w:name="_t8dgtaszy9b3" w:id="3"/>
+      <w:bookmarkStart w:colFirst="0" w:colLast="0" w:name="_xmop9bb7psq7" w:id="3"/>
       <w:bookmarkEnd w:id="3"/>
       <w:r>
         <w:rPr>
@@ -172,13 +172,13 @@
           <w:bCs w:val="1"/>
           <w:rtl w:val="0"/>
         </w:rPr>
-        <w:t xml:space="preserve">Força estimada:</w:t>
-      </w:r>
-      <w:r>
-        <w:rPr>
-          <w:rtl w:val="0"/>
-        </w:rPr>
-        <w:t xml:space="preserve"> 2 horas</w:t>
+        <w:t xml:space="preserve">Esforço Estimado:</w:t>
+      </w:r>
+      <w:r>
+        <w:rPr>
+          <w:rtl w:val="0"/>
+        </w:rPr>
+        <w:t xml:space="preserve"> Médio</w:t>
       </w:r>
     </w:p>
     <w:p>
@@ -210,7 +210,7 @@
           <w:szCs w:val="26"/>
         </w:rPr>
       </w:pPr>
-      <w:bookmarkStart w:colFirst="0" w:colLast="0" w:name="_tjbaxjgsmv2p" w:id="4"/>
+      <w:bookmarkStart w:colFirst="0" w:colLast="0" w:name="_rtot7mohfmnm" w:id="4"/>
       <w:bookmarkEnd w:id="4"/>
       <w:r>
         <w:rPr>
@@ -282,7 +282,7 @@
         <w:rPr>
           <w:rtl w:val="0"/>
         </w:rPr>
-        <w:t xml:space="preserve"> 1 hora</w:t>
+        <w:t xml:space="preserve"> Baixo</w:t>
       </w:r>
     </w:p>
     <w:p>

</xml_diff>